<commit_message>
Update Code for GIS Server
</commit_message>
<xml_diff>
--- a/RakshaGIS_Project_WriteUp.docx
+++ b/RakshaGIS_Project_WriteUp.docx
@@ -1344,7 +1344,317 @@
           <w:color w:val="1F5EA8"/>
           <w:sz w:val="24"/>
         </w:rPr>
-        <w:t>3.9  UI Themes</w:t>
+        <w:t>3.9  External Data Layers</w:t>
+      </w:r>
+    </w:p>
+    <w:p>
+      <w:pPr>
+        <w:spacing w:after="100" w:before="40"/>
+      </w:pPr>
+      <w:r>
+        <w:rPr>
+          <w:color w:val="1A1A2E"/>
+          <w:sz w:val="21"/>
+        </w:rPr>
+        <w:t>RakshaGIS supports two types of externally-sourced read-only layers, both accessible from the map toolbar's Layers &amp; Tools panel.</w:t>
+      </w:r>
+    </w:p>
+    <w:p>
+      <w:pPr>
+        <w:spacing w:before="160" w:after="120"/>
+      </w:pPr>
+      <w:r>
+        <w:rPr>
+          <w:b/>
+          <w:color w:val="4A6A00"/>
+          <w:sz w:val="22"/>
+        </w:rPr>
+        <w:t>3.9a  External Database Layers (SuperAdmin)</w:t>
+      </w:r>
+    </w:p>
+    <w:p>
+      <w:pPr>
+        <w:pStyle w:val="ListBullet"/>
+        <w:spacing w:after="60" w:before="20"/>
+      </w:pPr>
+      <w:r>
+        <w:rPr>
+          <w:color w:val="1A1A2E"/>
+          <w:sz w:val="21"/>
+        </w:rPr>
+        <w:t>Renders geometry queried live from a separate PostgreSQL/PostGIS database (e.g. DGDE operational DB) without copying data into RakshaGIS. Uses psycopg2 for direct queries; returns GeoJSON.</w:t>
+      </w:r>
+    </w:p>
+    <w:p>
+      <w:pPr>
+        <w:pStyle w:val="ListBullet"/>
+        <w:spacing w:after="60" w:before="20"/>
+      </w:pPr>
+      <w:r>
+        <w:rPr>
+          <w:color w:val="1A1A2E"/>
+          <w:sz w:val="21"/>
+        </w:rPr>
+        <w:t>Org-level row filtering: DGDE/SUPERADMIN see all rows; PDDE/DEO/CEO/ADEO see only rows matching their office code.</w:t>
+      </w:r>
+    </w:p>
+    <w:p>
+      <w:pPr>
+        <w:pStyle w:val="ListBullet"/>
+        <w:spacing w:after="60" w:before="20"/>
+      </w:pPr>
+      <w:r>
+        <w:rPr>
+          <w:color w:val="1A1A2E"/>
+          <w:sz w:val="21"/>
+        </w:rPr>
+        <w:t>Per-layer styling: stroke, fill colour/opacity, QGIS-style fill patterns, and thematic (classification) colouring.</w:t>
+      </w:r>
+    </w:p>
+    <w:p>
+      <w:pPr>
+        <w:pStyle w:val="ListBullet"/>
+        <w:spacing w:after="60" w:before="20"/>
+      </w:pPr>
+      <w:r>
+        <w:rPr>
+          <w:color w:val="1A1A2E"/>
+          <w:sz w:val="21"/>
+        </w:rPr>
+        <w:t>Viewport (bbox) spatial filtering to avoid loading unnecessary geometry for large tables.</w:t>
+      </w:r>
+    </w:p>
+    <w:p>
+      <w:pPr>
+        <w:pStyle w:val="ListBullet"/>
+        <w:spacing w:after="60" w:before="20"/>
+      </w:pPr>
+      <w:r>
+        <w:rPr>
+          <w:color w:val="1A1A2E"/>
+          <w:sz w:val="21"/>
+        </w:rPr>
+        <w:t>Configuration via Settings → External Data (SuperAdmin only): add DB connection, register table as a layer, set filter fields, refresh feature count and bounding box.</w:t>
+      </w:r>
+    </w:p>
+    <w:p>
+      <w:pPr>
+        <w:spacing w:before="160" w:after="120"/>
+      </w:pPr>
+      <w:r>
+        <w:rPr>
+          <w:b/>
+          <w:color w:val="4A6A00"/>
+          <w:sz w:val="22"/>
+        </w:rPr>
+        <w:t>3.9b  GIS Server Layers (All Users)</w:t>
+      </w:r>
+    </w:p>
+    <w:p>
+      <w:pPr>
+        <w:spacing w:after="100" w:before="40"/>
+      </w:pPr>
+      <w:r>
+        <w:rPr>
+          <w:color w:val="1A1A2E"/>
+          <w:sz w:val="21"/>
+        </w:rPr>
+        <w:t>Any authenticated user can register external GIS servers and add layers from them. This enables field offices to consume their own WMS/WFS/ArcGIS services without requiring SuperAdmin involvement.</w:t>
+      </w:r>
+    </w:p>
+    <w:p>
+      <w:pPr>
+        <w:pStyle w:val="ListBullet"/>
+        <w:spacing w:after="60" w:before="20"/>
+      </w:pPr>
+      <w:r>
+        <w:rPr>
+          <w:color w:val="1A1A2E"/>
+          <w:sz w:val="21"/>
+        </w:rPr>
+        <w:t>Supported protocols: WMS, WMTS, WFS, ArcGIS Map Service, ArcGIS Feature Service, XYZ tile layers.</w:t>
+      </w:r>
+    </w:p>
+    <w:p>
+      <w:pPr>
+        <w:pStyle w:val="ListBullet"/>
+        <w:spacing w:after="60" w:before="20"/>
+      </w:pPr>
+      <w:r>
+        <w:rPr>
+          <w:color w:val="1A1A2E"/>
+          <w:sz w:val="21"/>
+        </w:rPr>
+        <w:t>Supported server types: GeoServer, ArcGIS Server, MapServer, QGIS Server, and any generic OGC/XYZ endpoint.</w:t>
+      </w:r>
+    </w:p>
+    <w:p>
+      <w:pPr>
+        <w:pStyle w:val="ListBullet"/>
+        <w:spacing w:after="60" w:before="20"/>
+      </w:pPr>
+      <w:r>
+        <w:rPr>
+          <w:color w:val="1A1A2E"/>
+          <w:sz w:val="21"/>
+        </w:rPr>
+        <w:t>Auto-discovery via GetCapabilities: click "Discover" on any registered server to see all available layers and one-click register them.</w:t>
+      </w:r>
+    </w:p>
+    <w:p>
+      <w:pPr>
+        <w:pStyle w:val="ListBullet"/>
+        <w:spacing w:after="60" w:before="20"/>
+      </w:pPr>
+      <w:r>
+        <w:rPr>
+          <w:color w:val="1A1A2E"/>
+          <w:sz w:val="21"/>
+        </w:rPr>
+        <w:t>Org-scoped visibility: layers added by non-SUPERADMIN users are automatically tagged with the user's organisation and are visible only within that organisation. Layers added by SUPERADMIN have organisation = null and are globally visible to all users.</w:t>
+      </w:r>
+    </w:p>
+    <w:p>
+      <w:pPr>
+        <w:pStyle w:val="ListBullet"/>
+        <w:spacing w:after="60" w:before="20"/>
+      </w:pPr>
+      <w:r>
+        <w:rPr>
+          <w:color w:val="1A1A2E"/>
+          <w:sz w:val="21"/>
+        </w:rPr>
+        <w:t>Visual tagging: cyan "Global" badge for SUPERADMIN layers; purple organisation name badge for org-scoped layers.</w:t>
+      </w:r>
+    </w:p>
+    <w:p>
+      <w:pPr>
+        <w:pStyle w:val="ListBullet"/>
+        <w:spacing w:after="60" w:before="20"/>
+      </w:pPr>
+      <w:r>
+        <w:rPr>
+          <w:color w:val="1A1A2E"/>
+          <w:sz w:val="21"/>
+        </w:rPr>
+        <w:t>Configurable opacity per layer via a real-time slider when the layer is visible on the map.</w:t>
+      </w:r>
+    </w:p>
+    <w:p>
+      <w:pPr>
+        <w:pStyle w:val="ListBullet"/>
+        <w:spacing w:after="60" w:before="20"/>
+      </w:pPr>
+      <w:r>
+        <w:rPr>
+          <w:color w:val="1A1A2E"/>
+          <w:sz w:val="21"/>
+        </w:rPr>
+        <w:t>Vector layers (WFS/ArcGIS Feature) support classification colouring and custom style rules; tile layers (WMS/WMTS/XYZ) support opacity control.</w:t>
+      </w:r>
+    </w:p>
+    <w:p>
+      <w:pPr>
+        <w:pStyle w:val="ListBullet"/>
+        <w:spacing w:after="60" w:before="20"/>
+      </w:pPr>
+      <w:r>
+        <w:rPr>
+          <w:color w:val="1A1A2E"/>
+          <w:sz w:val="21"/>
+        </w:rPr>
+        <w:t>Accessible from Map → Layers &amp; Tools → GIS Servers tab. Non-SUPERADMIN users land on this tab by default when opening the panel.</w:t>
+      </w:r>
+    </w:p>
+    <w:p>
+      <w:pPr>
+        <w:spacing w:before="160" w:after="120"/>
+      </w:pPr>
+      <w:r>
+        <w:rPr>
+          <w:b/>
+          <w:color w:val="1F5EA8"/>
+          <w:sz w:val="24"/>
+        </w:rPr>
+        <w:t>3.10  Map Export &amp; High-Resolution Printing</w:t>
+      </w:r>
+    </w:p>
+    <w:p>
+      <w:pPr>
+        <w:pStyle w:val="ListBullet"/>
+        <w:spacing w:after="60" w:before="20"/>
+      </w:pPr>
+      <w:r>
+        <w:rPr>
+          <w:color w:val="1A1A2E"/>
+          <w:sz w:val="21"/>
+        </w:rPr>
+        <w:t>PDF export (jsPDF): instant client-side A4/A3/Letter layout with captured map canvas, north arrow, scale bar, legend, optional coordinate grid, and DGDE-branded header/footer.</w:t>
+      </w:r>
+    </w:p>
+    <w:p>
+      <w:pPr>
+        <w:pStyle w:val="ListBullet"/>
+        <w:spacing w:after="60" w:before="20"/>
+      </w:pPr>
+      <w:r>
+        <w:rPr>
+          <w:color w:val="1A1A2E"/>
+          <w:sz w:val="21"/>
+        </w:rPr>
+        <w:t>GeoTIFF / PNG export at 150 DPI or 300 DPI: captures the full map canvas including basemap raster tiles and all vector layers; exports as a georeferenced GeoTIFF with embedded world-file metadata.</w:t>
+      </w:r>
+    </w:p>
+    <w:p>
+      <w:pPr>
+        <w:pStyle w:val="ListBullet"/>
+        <w:spacing w:after="60" w:before="20"/>
+      </w:pPr>
+      <w:r>
+        <w:rPr>
+          <w:color w:val="1A1A2E"/>
+          <w:sz w:val="21"/>
+        </w:rPr>
+        <w:t>300 DPI tile-loading fix: waitForTilesLoaded() is registered before renderSync() so that tileloadstart events are captured as soon as the render triggers tile requests. The export waits for an 800 ms idle period, then a 400 ms post-last-tile settle, then a 300 ms final settle before compositing — ensuring basemap tiles are fully loaded at high resolution.</w:t>
+      </w:r>
+    </w:p>
+    <w:p>
+      <w:pPr>
+        <w:pStyle w:val="ListBullet"/>
+        <w:spacing w:after="60" w:before="20"/>
+      </w:pPr>
+      <w:r>
+        <w:rPr>
+          <w:color w:val="1A1A2E"/>
+          <w:sz w:val="21"/>
+        </w:rPr>
+        <w:t>Server-side Mapnik export: renders directly from PostGIS at arbitrary resolution using XML map styles for publication-quality cartographic output.</w:t>
+      </w:r>
+    </w:p>
+    <w:p>
+      <w:pPr>
+        <w:pStyle w:val="ListBullet"/>
+        <w:spacing w:after="60" w:before="20"/>
+      </w:pPr>
+      <w:r>
+        <w:rPr>
+          <w:color w:val="1A1A2E"/>
+          <w:sz w:val="21"/>
+        </w:rPr>
+        <w:t>ArcGIS-style server PDF export via Playwright/print-service for complex layout requirements.</w:t>
+      </w:r>
+    </w:p>
+    <w:p>
+      <w:pPr>
+        <w:spacing w:before="160" w:after="120"/>
+      </w:pPr>
+      <w:r>
+        <w:rPr>
+          <w:b/>
+          <w:color w:val="1F5EA8"/>
+          <w:sz w:val="24"/>
+        </w:rPr>
+        <w:t>3.11  UI Themes</w:t>
       </w:r>
     </w:p>
     <w:p>
@@ -1396,7 +1706,7 @@
           <w:color w:val="1F5EA8"/>
           <w:sz w:val="24"/>
         </w:rPr>
-        <w:t>3.10  Infrastructure, DevOps &amp; Offline Operation</w:t>
+        <w:t>3.12  Infrastructure, DevOps &amp; Offline Operation</w:t>
       </w:r>
     </w:p>
     <w:p>
@@ -2714,7 +3024,7 @@
                 <w:color w:val="1A1A2E"/>
                 <w:sz w:val="19"/>
               </w:rPr>
-              <w:t>Web server</w:t>
+              <w:t>Map rendering</w:t>
             </w:r>
           </w:p>
         </w:tc>
@@ -2729,7 +3039,7 @@
                 <w:color w:val="1A1A2E"/>
                 <w:sz w:val="19"/>
               </w:rPr>
-              <w:t>Nginx 1.27 + Gunicorn (4 workers)</w:t>
+              <w:t>Mapnik + python-mapnik</w:t>
             </w:r>
           </w:p>
         </w:tc>
@@ -2744,7 +3054,7 @@
                 <w:color w:val="1A1A2E"/>
                 <w:sz w:val="19"/>
               </w:rPr>
-              <w:t>Reverse proxy, static file serving</w:t>
+              <w:t>Server-side high-resolution raster map export from PostGIS</w:t>
             </w:r>
           </w:p>
         </w:tc>
@@ -2762,7 +3072,7 @@
                 <w:color w:val="1A1A2E"/>
                 <w:sz w:val="19"/>
               </w:rPr>
-              <w:t>Containerisation</w:t>
+              <w:t>Web server</w:t>
             </w:r>
           </w:p>
         </w:tc>
@@ -2777,7 +3087,7 @@
                 <w:color w:val="1A1A2E"/>
                 <w:sz w:val="19"/>
               </w:rPr>
-              <w:t>Docker 24 + Docker Compose v2</w:t>
+              <w:t>Nginx 1.27 + Daphne (ASGI)</w:t>
             </w:r>
           </w:p>
         </w:tc>
@@ -2792,7 +3102,7 @@
                 <w:color w:val="1A1A2E"/>
                 <w:sz w:val="19"/>
               </w:rPr>
-              <w:t>Isolated, reproducible on-premise deployment</w:t>
+              <w:t>Reverse proxy, static file serving, WebSocket</w:t>
             </w:r>
           </w:p>
         </w:tc>
@@ -2810,7 +3120,7 @@
                 <w:color w:val="1A1A2E"/>
                 <w:sz w:val="19"/>
               </w:rPr>
-              <w:t>API documentation</w:t>
+              <w:t>Containerisation</w:t>
             </w:r>
           </w:p>
         </w:tc>
@@ -2825,7 +3135,7 @@
                 <w:color w:val="1A1A2E"/>
                 <w:sz w:val="19"/>
               </w:rPr>
-              <w:t>drf-spectacular 0.27</w:t>
+              <w:t>Docker 24 + Docker Compose v2</w:t>
             </w:r>
           </w:p>
         </w:tc>
@@ -2840,7 +3150,7 @@
                 <w:color w:val="1A1A2E"/>
                 <w:sz w:val="19"/>
               </w:rPr>
-              <w:t>OpenAPI 3 schema + Swagger UI</w:t>
+              <w:t>Isolated, reproducible on-premise deployment</w:t>
             </w:r>
           </w:p>
         </w:tc>
@@ -2858,7 +3168,7 @@
                 <w:color w:val="1A1A2E"/>
                 <w:sz w:val="19"/>
               </w:rPr>
-              <w:t>File validation</w:t>
+              <w:t>API documentation</w:t>
             </w:r>
           </w:p>
         </w:tc>
@@ -2873,6 +3183,54 @@
                 <w:color w:val="1A1A2E"/>
                 <w:sz w:val="19"/>
               </w:rPr>
+              <w:t>drf-spectacular 0.27</w:t>
+            </w:r>
+          </w:p>
+        </w:tc>
+        <w:tc>
+          <w:tcPr>
+            <w:tcW w:type="dxa" w:w="3744"/>
+            <w:shd w:val="clear" w:color="auto" w:fill="FFFFFF"/>
+          </w:tcPr>
+          <w:p>
+            <w:r>
+              <w:rPr>
+                <w:color w:val="1A1A2E"/>
+                <w:sz w:val="19"/>
+              </w:rPr>
+              <w:t>OpenAPI 3 schema + Swagger UI</w:t>
+            </w:r>
+          </w:p>
+        </w:tc>
+      </w:tr>
+      <w:tr>
+        <w:tc>
+          <w:tcPr>
+            <w:tcW w:type="dxa" w:w="2304"/>
+            <w:shd w:val="clear" w:color="auto" w:fill="F0F4F8"/>
+          </w:tcPr>
+          <w:p>
+            <w:r>
+              <w:rPr>
+                <w:b/>
+                <w:color w:val="1A1A2E"/>
+                <w:sz w:val="19"/>
+              </w:rPr>
+              <w:t>File validation</w:t>
+            </w:r>
+          </w:p>
+        </w:tc>
+        <w:tc>
+          <w:tcPr>
+            <w:tcW w:type="dxa" w:w="3456"/>
+            <w:shd w:val="clear" w:color="auto" w:fill="F0F4F8"/>
+          </w:tcPr>
+          <w:p>
+            <w:r>
+              <w:rPr>
+                <w:color w:val="1A1A2E"/>
+                <w:sz w:val="19"/>
+              </w:rPr>
               <w:t>python-magic 0.4</w:t>
             </w:r>
           </w:p>
@@ -2880,7 +3238,7 @@
         <w:tc>
           <w:tcPr>
             <w:tcW w:type="dxa" w:w="3744"/>
-            <w:shd w:val="clear" w:color="auto" w:fill="FFFFFF"/>
+            <w:shd w:val="clear" w:color="auto" w:fill="F0F4F8"/>
           </w:tcPr>
           <w:p>
             <w:r>
@@ -3391,6 +3749,48 @@
           <w:sz w:val="21"/>
         </w:rPr>
         <w:t>Survey-area report generation (.docx, editable in OnlyOffice) and proximity / encroachment analysis reports are delivered; ministry-prescribed template formats are in progress.</w:t>
+      </w:r>
+    </w:p>
+    <w:p>
+      <w:pPr>
+        <w:pStyle w:val="ListBullet"/>
+        <w:spacing w:after="80" w:before="20"/>
+      </w:pPr>
+      <w:r>
+        <w:rPr>
+          <w:b/>
+          <w:color w:val="4A6A00"/>
+          <w:sz w:val="21"/>
+        </w:rPr>
+        <w:t xml:space="preserve">GIS Server Layers for all users: </w:t>
+      </w:r>
+      <w:r>
+        <w:rPr>
+          <w:color w:val="1A1A2E"/>
+          <w:sz w:val="21"/>
+        </w:rPr>
+        <w:t>Any authenticated user can register WMS, WFS, ArcGIS, and XYZ server connections and add layers. Layers are automatically org-scoped (visible only within the user's organisation); SUPERADMIN-added layers are global. Auto-discovery via GetCapabilities is supported.</w:t>
+      </w:r>
+    </w:p>
+    <w:p>
+      <w:pPr>
+        <w:pStyle w:val="ListBullet"/>
+        <w:spacing w:after="80" w:before="20"/>
+      </w:pPr>
+      <w:r>
+        <w:rPr>
+          <w:b/>
+          <w:color w:val="4A6A00"/>
+          <w:sz w:val="21"/>
+        </w:rPr>
+        <w:t xml:space="preserve">300 DPI map export: </w:t>
+      </w:r>
+      <w:r>
+        <w:rPr>
+          <w:color w:val="1A1A2E"/>
+          <w:sz w:val="21"/>
+        </w:rPr>
+        <w:t>Client-side GeoTIFF/PNG export at 150 or 300 DPI with correct tile-loading wait — a waitForTilesLoaded() listener is attached before renderSync() to ensure all basemap tiles are fully loaded before canvas composite, eliminating blur at high resolution.</w:t>
       </w:r>
     </w:p>
     <w:p>
@@ -3529,7 +3929,7 @@
           <w:color w:val="555555"/>
           <w:sz w:val="17"/>
         </w:rPr>
-        <w:t>RakshaGIS — Defence Estate GIS Survey Platform  |  Prepared: 03 June 2026  |  DGDE, Government of India  |  CONFIDENTIAL</w:t>
+        <w:t>RakshaGIS — Defence Estate GIS Survey Platform  |  Prepared: 05 June 2026  |  DGDE, Government of India  |  CONFIDENTIAL</w:t>
       </w:r>
     </w:p>
     <w:sectPr>

</xml_diff>

<commit_message>
Revenue Portal Connectors ========================== Allows administrators to register government revenue portal endpoints (DILRMP, Bhuvan, Bhu-Naksha, any state WFS/REST portal) and cross-reference registered DefenceParcels against the state revenue records pulled from those portals.
All connection parameters — URL, layer name, auth, portal-specific options — are
fully user-configurable; no defaults are hard-coded.
</commit_message>
<xml_diff>
--- a/RakshaGIS_Project_WriteUp.docx
+++ b/RakshaGIS_Project_WriteUp.docx
@@ -129,7 +129,7 @@
           <w:color w:val="1A1A2E"/>
           <w:sz w:val="21"/>
         </w:rPr>
-        <w:t>RakshaGIS is a full-stack, self-hosted enterprise GIS platform developed for the Directorate General of Defence Estates (DGDE) to digitise, manage, review, and publish defence land surveys across India. The system consolidates field surveying, internal approval workflows, in-browser document editing, AI-assisted document processing, and map publishing into a single role-gated application — hosted entirely on-premise with zero dependency on commercial cloud services or internet access after initial installation.</w:t>
+        <w:t>RakshaGIS is a full-stack, self-hosted enterprise GIS platform developed for the Directorate General of Defence Estates (DGDE) to digitise, manage, review, and publish defence land surveys across India. The system consolidates field surveying, internal approval workflows, in-browser document editing, AI-assisted document processing, 3D terrain analysis, offline-first field companion, C2PA provenance watermarking, and map publishing into a single role-gated application — hosted entirely on-premise with zero dependency on commercial cloud services or internet access after initial installation.</w:t>
       </w:r>
     </w:p>
     <w:p>
@@ -234,14 +234,35 @@
           <w:color w:val="1F5EA8"/>
           <w:sz w:val="21"/>
         </w:rPr>
-        <w:t xml:space="preserve">Organisation-wise data isolation: </w:t>
+        <w:t xml:space="preserve">Strict office-level data isolation: </w:t>
       </w:r>
       <w:r>
         <w:rPr>
           <w:color w:val="1A1A2E"/>
           <w:sz w:val="21"/>
         </w:rPr>
-        <w:t>Enforce strict row-level data isolation so each office (DEO/CEO/ADEO) sees only its own data, while PDDE offices see their command jurisdiction and DGDE has all-India visibility. Controlled cross-org access is available via a formal request-and-approval mechanism.</w:t>
+        <w:t>Enforce row-level isolation so each office sees only its own content. DGDE and PDDE offices reach subordinate offices exclusively through the published Map Viewer — they cannot view, add, edit, or delete sub-office projects, documents, or features. A single central hq_level() helper enforces this across all API endpoints.</w:t>
+      </w:r>
+    </w:p>
+    <w:p>
+      <w:pPr>
+        <w:pStyle w:val="ListBullet"/>
+        <w:spacing w:after="80" w:before="20"/>
+      </w:pPr>
+      <w:r>
+        <w:rPr>
+          <w:b/>
+          <w:color w:val="1F5EA8"/>
+          <w:sz w:val="21"/>
+        </w:rPr>
+        <w:t xml:space="preserve">Provenance and authenticity: </w:t>
+      </w:r>
+      <w:r>
+        <w:rPr>
+          <w:color w:val="1A1A2E"/>
+          <w:sz w:val="21"/>
+        </w:rPr>
+        <w:t>All exported files (terrain PNGs, GeoJSON, documents, report PDFs) carry C2PA cryptographic provenance assertions and Living Provenance DNA steganographic watermarks binding the export to the project, uploader, and timestamp.</w:t>
       </w:r>
     </w:p>
     <w:p>
@@ -1167,6 +1188,19 @@
     </w:p>
     <w:p>
       <w:pPr>
+        <w:pStyle w:val="ListBullet"/>
+        <w:spacing w:after="60" w:before="20"/>
+      </w:pPr>
+      <w:r>
+        <w:rPr>
+          <w:color w:val="1A1A2E"/>
+          <w:sz w:val="21"/>
+        </w:rPr>
+        <w:t>SUPERADMIN accounts attached to a DGDE or PDDE organisation are subject to the same isolation rules as any other HQ user — only a global superadmin (no organisation assigned) retains unrestricted system-level access.</w:t>
+      </w:r>
+    </w:p>
+    <w:p>
+      <w:pPr>
         <w:spacing w:before="160" w:after="120"/>
       </w:pPr>
       <w:r>
@@ -1875,6 +1909,739 @@
           <w:sz w:val="21"/>
         </w:rPr>
         <w:t>extra_hosts: host.docker.internal:host-gateway — allows containers to reach Ollama running on the host machine even with internal networking.</w:t>
+      </w:r>
+    </w:p>
+    <w:p>
+      <w:pPr>
+        <w:spacing w:before="160" w:after="120"/>
+      </w:pPr>
+      <w:r>
+        <w:rPr>
+          <w:b/>
+          <w:color w:val="1F5EA8"/>
+          <w:sz w:val="24"/>
+        </w:rPr>
+        <w:t>3.13  Mandatory Two-Factor Authentication (TOTP)</w:t>
+      </w:r>
+    </w:p>
+    <w:p>
+      <w:pPr>
+        <w:spacing w:after="100" w:before="40"/>
+      </w:pPr>
+      <w:r>
+        <w:rPr>
+          <w:color w:val="1A1A2E"/>
+          <w:sz w:val="21"/>
+        </w:rPr>
+        <w:t>All accounts are required to enrol in and use TOTP-based two-factor authentication. There is no bypass — a session token is never issued without a valid OTP.</w:t>
+      </w:r>
+    </w:p>
+    <w:p>
+      <w:pPr>
+        <w:pStyle w:val="ListBullet"/>
+        <w:spacing w:after="60" w:before="20"/>
+      </w:pPr>
+      <w:r>
+        <w:rPr>
+          <w:color w:val="1A1A2E"/>
+          <w:sz w:val="21"/>
+        </w:rPr>
+        <w:t>First login: the backend returns a requires_2fa_setup status; the login page presents a QR code (base32 URI) generated by pyotp. The user scans it with any TOTP app (Google Authenticator, Authy, Microsoft Authenticator) and confirms the first code. Only then is the session token issued.</w:t>
+      </w:r>
+    </w:p>
+    <w:p>
+      <w:pPr>
+        <w:pStyle w:val="ListBullet"/>
+        <w:spacing w:after="60" w:before="20"/>
+      </w:pPr>
+      <w:r>
+        <w:rPr>
+          <w:color w:val="1A1A2E"/>
+          <w:sz w:val="21"/>
+        </w:rPr>
+        <w:t>Subsequent logins: the backend returns requires_2fa; the login page prompts for a 6-digit OTP. Django validates it against the stored secret with a ±60 s tolerance (valid_window=2) to handle minor clock drift.</w:t>
+      </w:r>
+    </w:p>
+    <w:p>
+      <w:pPr>
+        <w:pStyle w:val="ListBullet"/>
+        <w:spacing w:after="60" w:before="20"/>
+      </w:pPr>
+      <w:r>
+        <w:rPr>
+          <w:color w:val="1A1A2E"/>
+          <w:sz w:val="21"/>
+        </w:rPr>
+        <w:t>Backend model: TOTPDevice stores per-user secret; two dedicated endpoints — /api/accounts/auth/2fa/setup-begin/ and /api/accounts/auth/2fa/setup-complete/ — handle the enrolment flow.</w:t>
+      </w:r>
+    </w:p>
+    <w:p>
+      <w:pPr>
+        <w:pStyle w:val="ListBullet"/>
+        <w:spacing w:after="60" w:before="20"/>
+      </w:pPr>
+      <w:r>
+        <w:rPr>
+          <w:color w:val="1A1A2E"/>
+          <w:sz w:val="21"/>
+        </w:rPr>
+        <w:t>The login endpoint never issues tokens directly; it always returns a pending-2fa status that the frontend dispatches to the appropriate step.</w:t>
+      </w:r>
+    </w:p>
+    <w:p>
+      <w:pPr>
+        <w:spacing w:before="160" w:after="120"/>
+      </w:pPr>
+      <w:r>
+        <w:rPr>
+          <w:b/>
+          <w:color w:val="1F5EA8"/>
+          <w:sz w:val="24"/>
+        </w:rPr>
+        <w:t>3.14  3D Terrain Analysis &amp; DEM Tools</w:t>
+      </w:r>
+    </w:p>
+    <w:p>
+      <w:pPr>
+        <w:spacing w:after="100" w:before="40"/>
+      </w:pPr>
+      <w:r>
+        <w:rPr>
+          <w:color w:val="1A1A2E"/>
+          <w:sz w:val="21"/>
+        </w:rPr>
+        <w:t>The Cesium.js 3D terrain viewer at /terrain has been extended with a comprehensive suite of Digital Elevation Model (DEM) analysis tools and vector overlay capabilities.</w:t>
+      </w:r>
+    </w:p>
+    <w:p>
+      <w:pPr>
+        <w:pStyle w:val="ListBullet"/>
+        <w:spacing w:after="60" w:before="20"/>
+      </w:pPr>
+      <w:r>
+        <w:rPr>
+          <w:color w:val="1A1A2E"/>
+          <w:sz w:val="21"/>
+        </w:rPr>
+        <w:t>16 DEM analysis tools accessible from the left-side toolbar: Slope, Aspect, Hillshade, Curvature, TPI (Topographic Position Index), TRI (Terrain Ruggedness Index), Roughness, Flow Direction, Flow Accumulation, Viewshed, Least-Cost Path, Cut/Fill, Solar Radiation, Flood Simulation, Landslide Risk, and Erosion Potential.</w:t>
+      </w:r>
+    </w:p>
+    <w:p>
+      <w:pPr>
+        <w:pStyle w:val="ListBullet"/>
+        <w:spacing w:after="60" w:before="20"/>
+      </w:pPr>
+      <w:r>
+        <w:rPr>
+          <w:color w:val="1A1A2E"/>
+          <w:sz w:val="21"/>
+        </w:rPr>
+        <w:t>Each analysis tool produces a colour-rendered scene PNG with a legend panel (colour ramp + breakpoints) and a statistics panel (min/avg/max/std) composed below the 3D scene — no overlap with the terrain view.</w:t>
+      </w:r>
+    </w:p>
+    <w:p>
+      <w:pPr>
+        <w:pStyle w:val="ListBullet"/>
+        <w:spacing w:after="60" w:before="20"/>
+      </w:pPr>
+      <w:r>
+        <w:rPr>
+          <w:color w:val="1A1A2E"/>
+          <w:sz w:val="21"/>
+        </w:rPr>
+        <w:t>Slope analysis over a user-drawn rectangle: samples a configurable grid (up to 50×50 = 2,500 points) via the Elevation Lookup API; renders a colour-coded slope overlay; shows min/avg/max in degrees.</w:t>
+      </w:r>
+    </w:p>
+    <w:p>
+      <w:pPr>
+        <w:pStyle w:val="ListBullet"/>
+        <w:spacing w:after="60" w:before="20"/>
+      </w:pPr>
+      <w:r>
+        <w:rPr>
+          <w:color w:val="1A1A2E"/>
+          <w:sz w:val="21"/>
+        </w:rPr>
+        <w:t>Vector file upload into the 3D viewer: upload Shapefile (.zip), GeoJSON, KML, KMZ, or GeoPackage; Django backend parses with Fiona and returns WGS84 GeoJSON; Cesium renders as a 3D GeoJsonDataSource overlay.</w:t>
+      </w:r>
+    </w:p>
+    <w:p>
+      <w:pPr>
+        <w:pStyle w:val="ListBullet"/>
+        <w:spacing w:after="60" w:before="20"/>
+      </w:pPr>
+      <w:r>
+        <w:rPr>
+          <w:color w:val="1A1A2E"/>
+          <w:sz w:val="21"/>
+        </w:rPr>
+        <w:t>Slope analysis from vector: after loading a vector layer, click Analyze to run slope analysis over the layer bounding box in one click.</w:t>
+      </w:r>
+    </w:p>
+    <w:p>
+      <w:pPr>
+        <w:pStyle w:val="ListBullet"/>
+        <w:spacing w:after="60" w:before="20"/>
+      </w:pPr>
+      <w:r>
+        <w:rPr>
+          <w:color w:val="1A1A2E"/>
+          <w:sz w:val="21"/>
+        </w:rPr>
+        <w:t>All exports (PNG, GeoJSON, CSV) are watermarked before download via C2PA + LP-DNA pipeline.</w:t>
+      </w:r>
+    </w:p>
+    <w:p>
+      <w:pPr>
+        <w:pStyle w:val="ListBullet"/>
+        <w:spacing w:after="60" w:before="20"/>
+      </w:pPr>
+      <w:r>
+        <w:rPr>
+          <w:color w:val="1A1A2E"/>
+          <w:sz w:val="21"/>
+        </w:rPr>
+        <w:t>Offline SRTM setup: ./setup_terrain.sh downloads and converts tiles; scripts/generate_terrain_layer.py scans the tile tree and writes the correct layer.json availability index required by the Cesium quantized-mesh terrain client.</w:t>
+      </w:r>
+    </w:p>
+    <w:p>
+      <w:pPr>
+        <w:pStyle w:val="ListBullet"/>
+        <w:spacing w:after="60" w:before="20"/>
+      </w:pPr>
+      <w:r>
+        <w:rPr>
+          <w:color w:val="1A1A2E"/>
+          <w:sz w:val="21"/>
+        </w:rPr>
+        <w:t>PWA and Coordinate Tool panels are collapsed to icon-only by default; clicking the icon expands the panel.</w:t>
+      </w:r>
+    </w:p>
+    <w:p>
+      <w:pPr>
+        <w:spacing w:before="160" w:after="120"/>
+      </w:pPr>
+      <w:r>
+        <w:rPr>
+          <w:b/>
+          <w:color w:val="1F5EA8"/>
+          <w:sz w:val="24"/>
+        </w:rPr>
+        <w:t>3.15  C2PA &amp; Living Provenance DNA Watermarking</w:t>
+      </w:r>
+    </w:p>
+    <w:p>
+      <w:pPr>
+        <w:spacing w:after="100" w:before="40"/>
+      </w:pPr>
+      <w:r>
+        <w:rPr>
+          <w:color w:val="1A1A2E"/>
+          <w:sz w:val="21"/>
+        </w:rPr>
+        <w:t>All exports from RakshaGIS carry cryptographic and steganographic provenance watermarks that establish authenticity and bind the export to its source project and creator.</w:t>
+      </w:r>
+    </w:p>
+    <w:p>
+      <w:pPr>
+        <w:pStyle w:val="ListBullet"/>
+        <w:spacing w:after="60" w:before="20"/>
+      </w:pPr>
+      <w:r>
+        <w:rPr>
+          <w:color w:val="1A1A2E"/>
+          <w:sz w:val="21"/>
+        </w:rPr>
+        <w:t>C2PA (Content Authenticity Initiative): embeds cryptographic provenance assertions in the file metadata that can be verified by Adobe Content Credentials and other C2PA-aware tools. Applied to image and office-format exports.</w:t>
+      </w:r>
+    </w:p>
+    <w:p>
+      <w:pPr>
+        <w:pStyle w:val="ListBullet"/>
+        <w:spacing w:after="60" w:before="20"/>
+      </w:pPr>
+      <w:r>
+        <w:rPr>
+          <w:color w:val="1A1A2E"/>
+          <w:sz w:val="21"/>
+        </w:rPr>
+        <w:t>LP-DNA (Living Provenance DNA): invisible steganographic metadata embedded in the file binary that binds the export to the project ID, project number, uploader username, and timestamp. Applied to all export types including PDF reports.</w:t>
+      </w:r>
+    </w:p>
+    <w:p>
+      <w:pPr>
+        <w:pStyle w:val="ListBullet"/>
+        <w:spacing w:after="60" w:before="20"/>
+      </w:pPr>
+      <w:r>
+        <w:rPr>
+          <w:color w:val="1A1A2E"/>
+          <w:sz w:val="21"/>
+        </w:rPr>
+        <w:t>Central watermark pipeline at /api/core/watermark-file/ — all terrain analysis PNGs, GeoJSON downloads, CSV exports, uploaded documents, and AI-generated report PDFs pass through this endpoint.</w:t>
+      </w:r>
+    </w:p>
+    <w:p>
+      <w:pPr>
+        <w:pStyle w:val="ListBullet"/>
+        <w:spacing w:after="60" w:before="20"/>
+      </w:pPr>
+      <w:r>
+        <w:rPr>
+          <w:color w:val="1A1A2E"/>
+          <w:sz w:val="21"/>
+        </w:rPr>
+        <w:t>Frontend utility watermarkAndDownload() (frontend/src/utils/watermarkDownload.ts) posts the file to the watermark endpoint and triggers a browser download of the watermarked result.</w:t>
+      </w:r>
+    </w:p>
+    <w:p>
+      <w:pPr>
+        <w:spacing w:before="160" w:after="120"/>
+      </w:pPr>
+      <w:r>
+        <w:rPr>
+          <w:b/>
+          <w:color w:val="1F5EA8"/>
+          <w:sz w:val="24"/>
+        </w:rPr>
+        <w:t>3.16  Offline PWA Field Companion</w:t>
+      </w:r>
+    </w:p>
+    <w:p>
+      <w:pPr>
+        <w:spacing w:after="100" w:before="40"/>
+      </w:pPr>
+      <w:r>
+        <w:rPr>
+          <w:color w:val="1A1A2E"/>
+          <w:sz w:val="21"/>
+        </w:rPr>
+        <w:t>The Field Companion (/field-companion) is a Progressive Web App designed for surveyors operating in areas with intermittent or no network connectivity.</w:t>
+      </w:r>
+    </w:p>
+    <w:p>
+      <w:pPr>
+        <w:pStyle w:val="ListBullet"/>
+        <w:spacing w:after="60" w:before="20"/>
+      </w:pPr>
+      <w:r>
+        <w:rPr>
+          <w:color w:val="1A1A2E"/>
+          <w:sz w:val="21"/>
+        </w:rPr>
+        <w:t>Offline-first OpenLayers map: project layers are cached to IndexedDB when online; the map continues to function without a network.</w:t>
+      </w:r>
+    </w:p>
+    <w:p>
+      <w:pPr>
+        <w:pStyle w:val="ListBullet"/>
+        <w:spacing w:after="60" w:before="20"/>
+      </w:pPr>
+      <w:r>
+        <w:rPr>
+          <w:color w:val="1A1A2E"/>
+          <w:sz w:val="21"/>
+        </w:rPr>
+        <w:t>Project caching: tap "Cache for offline" on any project to store its features, survey areas, and attribute templates in the browser's IndexedDB.</w:t>
+      </w:r>
+    </w:p>
+    <w:p>
+      <w:pPr>
+        <w:pStyle w:val="ListBullet"/>
+        <w:spacing w:after="60" w:before="20"/>
+      </w:pPr>
+      <w:r>
+        <w:rPr>
+          <w:color w:val="1A1A2E"/>
+          <w:sz w:val="21"/>
+        </w:rPr>
+        <w:t>GPS tracking: real-time position indicator on the map; tap any map point to add a geo-referenced note with automatically captured coordinates.</w:t>
+      </w:r>
+    </w:p>
+    <w:p>
+      <w:pPr>
+        <w:pStyle w:val="ListBullet"/>
+        <w:spacing w:after="60" w:before="20"/>
+      </w:pPr>
+      <w:r>
+        <w:rPr>
+          <w:color w:val="1A1A2E"/>
+          <w:sz w:val="21"/>
+        </w:rPr>
+        <w:t>Offline feature queue: features added while offline are stored in a local outbox (IndexedDB) and synced automatically when connectivity is restored.</w:t>
+      </w:r>
+    </w:p>
+    <w:p>
+      <w:pPr>
+        <w:pStyle w:val="ListBullet"/>
+        <w:spacing w:after="60" w:before="20"/>
+      </w:pPr>
+      <w:r>
+        <w:rPr>
+          <w:color w:val="1A1A2E"/>
+          <w:sz w:val="21"/>
+        </w:rPr>
+        <w:t>Pending-sync badge: the PWA panel icon on the Map toolbar shows the count of features queued for sync.</w:t>
+      </w:r>
+    </w:p>
+    <w:p>
+      <w:pPr>
+        <w:pStyle w:val="ListBullet"/>
+        <w:spacing w:after="60" w:before="20"/>
+      </w:pPr>
+      <w:r>
+        <w:rPr>
+          <w:color w:val="1A1A2E"/>
+          <w:sz w:val="21"/>
+        </w:rPr>
+        <w:t>Auto-sync on reconnect: when the browser regains connectivity, the outbox flushes to the backend (POST /api/projects/features/) without user intervention.</w:t>
+      </w:r>
+    </w:p>
+    <w:p>
+      <w:pPr>
+        <w:pStyle w:val="ListBullet"/>
+        <w:spacing w:after="60" w:before="20"/>
+      </w:pPr>
+      <w:r>
+        <w:rPr>
+          <w:color w:val="1A1A2E"/>
+          <w:sz w:val="21"/>
+        </w:rPr>
+        <w:t>IndexedDB helpers are in frontend/src/utils/offlineStore.ts: cacheProject, getCachedProject, listCachedProjects, queueFeature, getOutbox, removeFromOutbox.</w:t>
+      </w:r>
+    </w:p>
+    <w:p>
+      <w:pPr>
+        <w:spacing w:before="160" w:after="120"/>
+      </w:pPr>
+      <w:r>
+        <w:rPr>
+          <w:b/>
+          <w:color w:val="1F5EA8"/>
+          <w:sz w:val="24"/>
+        </w:rPr>
+        <w:t>3.17  Per-Feature Comment Threads</w:t>
+      </w:r>
+    </w:p>
+    <w:p>
+      <w:pPr>
+        <w:spacing w:after="100" w:before="40"/>
+      </w:pPr>
+      <w:r>
+        <w:rPr>
+          <w:color w:val="1A1A2E"/>
+          <w:sz w:val="21"/>
+        </w:rPr>
+        <w:t>Any GIS feature carries a threaded discussion that allows surveyors, checkers, and approvers to collaborate on specific spatial elements without leaving the map.</w:t>
+      </w:r>
+    </w:p>
+    <w:p>
+      <w:pPr>
+        <w:pStyle w:val="ListBullet"/>
+        <w:spacing w:after="60" w:before="20"/>
+      </w:pPr>
+      <w:r>
+        <w:rPr>
+          <w:color w:val="1A1A2E"/>
+          <w:sz w:val="21"/>
+        </w:rPr>
+        <w:t>Comments stored in the FeatureComment model (feature FK, user, text, created_at).</w:t>
+      </w:r>
+    </w:p>
+    <w:p>
+      <w:pPr>
+        <w:pStyle w:val="ListBullet"/>
+        <w:spacing w:after="60" w:before="20"/>
+      </w:pPr>
+      <w:r>
+        <w:rPr>
+          <w:color w:val="1A1A2E"/>
+          <w:sz w:val="21"/>
+        </w:rPr>
+        <w:t>Displayed in the Feature Info drawer on the Map page with role-coloured user tags and an inline reply box.</w:t>
+      </w:r>
+    </w:p>
+    <w:p>
+      <w:pPr>
+        <w:pStyle w:val="ListBullet"/>
+        <w:spacing w:after="60" w:before="20"/>
+      </w:pPr>
+      <w:r>
+        <w:rPr>
+          <w:color w:val="1A1A2E"/>
+          <w:sz w:val="21"/>
+        </w:rPr>
+        <w:t>REST API: GET/POST /api/projects/feature-comments/?feature=&lt;id&gt;.</w:t>
+      </w:r>
+    </w:p>
+    <w:p>
+      <w:pPr>
+        <w:pStyle w:val="ListBullet"/>
+        <w:spacing w:after="60" w:before="20"/>
+      </w:pPr>
+      <w:r>
+        <w:rPr>
+          <w:color w:val="1A1A2E"/>
+          <w:sz w:val="21"/>
+        </w:rPr>
+        <w:t>Visible to all users with access to the project (respects org-level isolation).</w:t>
+      </w:r>
+    </w:p>
+    <w:p>
+      <w:pPr>
+        <w:spacing w:before="160" w:after="120"/>
+      </w:pPr>
+      <w:r>
+        <w:rPr>
+          <w:b/>
+          <w:color w:val="1F5EA8"/>
+          <w:sz w:val="24"/>
+        </w:rPr>
+        <w:t>3.18  Attribute Auto-Validator</w:t>
+      </w:r>
+    </w:p>
+    <w:p>
+      <w:pPr>
+        <w:spacing w:after="100" w:before="40"/>
+      </w:pPr>
+      <w:r>
+        <w:rPr>
+          <w:color w:val="1A1A2E"/>
+          <w:sz w:val="21"/>
+        </w:rPr>
+        <w:t>Every shapefile import automatically triggers a validation pass after import completes, ensuring data quality before the project advances through the workflow.</w:t>
+      </w:r>
+    </w:p>
+    <w:p>
+      <w:pPr>
+        <w:pStyle w:val="ListBullet"/>
+        <w:spacing w:after="60" w:before="20"/>
+      </w:pPr>
+      <w:r>
+        <w:rPr>
+          <w:color w:val="1A1A2E"/>
+          <w:sz w:val="21"/>
+        </w:rPr>
+        <w:t>Checks performed: duplicate feature IDs, missing required attributes (per project AttributeTemplate), zero-area polygons, and features whose bounding box lies entirely outside India.</w:t>
+      </w:r>
+    </w:p>
+    <w:p>
+      <w:pPr>
+        <w:pStyle w:val="ListBullet"/>
+        <w:spacing w:after="60" w:before="20"/>
+      </w:pPr>
+      <w:r>
+        <w:rPr>
+          <w:color w:val="1A1A2E"/>
+          <w:sz w:val="21"/>
+        </w:rPr>
+        <w:t>Results stored in ShapefileImport.validation_warnings (JSONField — list of warning dicts).</w:t>
+      </w:r>
+    </w:p>
+    <w:p>
+      <w:pPr>
+        <w:pStyle w:val="ListBullet"/>
+        <w:spacing w:after="60" w:before="20"/>
+      </w:pPr>
+      <w:r>
+        <w:rPr>
+          <w:color w:val="1A1A2E"/>
+          <w:sz w:val="21"/>
+        </w:rPr>
+        <w:t>Summary shown in the Import Status UI; an AI review task is also queued to check attribute completeness and suggest corrections via the local LLM.</w:t>
+      </w:r>
+    </w:p>
+    <w:p>
+      <w:pPr>
+        <w:pStyle w:val="ListBullet"/>
+        <w:spacing w:after="60" w:before="20"/>
+      </w:pPr>
+      <w:r>
+        <w:rPr>
+          <w:color w:val="1A1A2E"/>
+          <w:sz w:val="21"/>
+        </w:rPr>
+        <w:t>Validation runs in the same Celery task as the import — no additional user action required.</w:t>
+      </w:r>
+    </w:p>
+    <w:p>
+      <w:pPr>
+        <w:spacing w:before="160" w:after="120"/>
+      </w:pPr>
+      <w:r>
+        <w:rPr>
+          <w:b/>
+          <w:color w:val="1F5EA8"/>
+          <w:sz w:val="24"/>
+        </w:rPr>
+        <w:t>3.19  AI Survey Report Generator</w:t>
+      </w:r>
+    </w:p>
+    <w:p>
+      <w:pPr>
+        <w:spacing w:after="100" w:before="40"/>
+      </w:pPr>
+      <w:r>
+        <w:rPr>
+          <w:color w:val="1A1A2E"/>
+          <w:sz w:val="21"/>
+        </w:rPr>
+        <w:t>Generate a full AI-authored survey report for any project from the Reports page or AI Chat.</w:t>
+      </w:r>
+    </w:p>
+    <w:p>
+      <w:pPr>
+        <w:pStyle w:val="ListBullet"/>
+        <w:spacing w:after="60" w:before="20"/>
+      </w:pPr>
+      <w:r>
+        <w:rPr>
+          <w:color w:val="1A1A2E"/>
+          <w:sz w:val="21"/>
+        </w:rPr>
+        <w:t>The backend gathers project statistics (area counts by status, feature counts, document inventory, workflow history) and asks the local LLM to write a structured narrative with findings and recommendations.</w:t>
+      </w:r>
+    </w:p>
+    <w:p>
+      <w:pPr>
+        <w:pStyle w:val="ListBullet"/>
+        <w:spacing w:after="60" w:before="20"/>
+      </w:pPr>
+      <w:r>
+        <w:rPr>
+          <w:color w:val="1A1A2E"/>
+          <w:sz w:val="21"/>
+        </w:rPr>
+        <w:t>Output: formatted PDF (LP-DNA watermarked) stored as a project document + .docx automatically opened in OnlyOffice for review and annotation.</w:t>
+      </w:r>
+    </w:p>
+    <w:p>
+      <w:pPr>
+        <w:pStyle w:val="ListBullet"/>
+        <w:spacing w:after="60" w:before="20"/>
+      </w:pPr>
+      <w:r>
+        <w:rPr>
+          <w:color w:val="1A1A2E"/>
+          <w:sz w:val="21"/>
+        </w:rPr>
+        <w:t>Report type AI_SUMMARY added to ReportSchedule; accessible from Reports page or triggered via the AI Assistant.</w:t>
+      </w:r>
+    </w:p>
+    <w:p>
+      <w:pPr>
+        <w:pStyle w:val="ListBullet"/>
+        <w:spacing w:after="60" w:before="20"/>
+      </w:pPr>
+      <w:r>
+        <w:rPr>
+          <w:color w:val="1A1A2E"/>
+          <w:sz w:val="21"/>
+        </w:rPr>
+        <w:t>Fully local — inference runs on-premise via Ollama with no internet dependency.</w:t>
+      </w:r>
+    </w:p>
+    <w:p>
+      <w:pPr>
+        <w:spacing w:before="160" w:after="120"/>
+      </w:pPr>
+      <w:r>
+        <w:rPr>
+          <w:b/>
+          <w:color w:val="1F5EA8"/>
+          <w:sz w:val="24"/>
+        </w:rPr>
+        <w:t>3.20  Office Drilldown Dashboard</w:t>
+      </w:r>
+    </w:p>
+    <w:p>
+      <w:pPr>
+        <w:spacing w:after="100" w:before="40"/>
+      </w:pPr>
+      <w:r>
+        <w:rPr>
+          <w:color w:val="1A1A2E"/>
+          <w:sz w:val="21"/>
+        </w:rPr>
+        <w:t>DGDE and PDDE users have access to a hierarchical statistics dashboard showing aggregated activity across the office tree without exposing per-project content.</w:t>
+      </w:r>
+    </w:p>
+    <w:p>
+      <w:pPr>
+        <w:pStyle w:val="ListBullet"/>
+        <w:spacing w:after="60" w:before="20"/>
+      </w:pPr>
+      <w:r>
+        <w:rPr>
+          <w:color w:val="1A1A2E"/>
+          <w:sz w:val="21"/>
+        </w:rPr>
+        <w:t>DGDE drilldown: national totals → click any PDDE command → click any DEO within that command.</w:t>
+      </w:r>
+    </w:p>
+    <w:p>
+      <w:pPr>
+        <w:pStyle w:val="ListBullet"/>
+        <w:spacing w:after="60" w:before="20"/>
+      </w:pPr>
+      <w:r>
+        <w:rPr>
+          <w:color w:val="1A1A2E"/>
+          <w:sz w:val="21"/>
+        </w:rPr>
+        <w:t>PDDE drilldown: own command totals → click any DEO within the command.</w:t>
+      </w:r>
+    </w:p>
+    <w:p>
+      <w:pPr>
+        <w:pStyle w:val="ListBullet"/>
+        <w:spacing w:after="60" w:before="20"/>
+      </w:pPr>
+      <w:r>
+        <w:rPr>
+          <w:color w:val="1A1A2E"/>
+          <w:sz w:val="21"/>
+        </w:rPr>
+        <w:t>Each level shows: project counts by status, survey area counts, feature counts, document counts, active user counts.</w:t>
+      </w:r>
+    </w:p>
+    <w:p>
+      <w:pPr>
+        <w:pStyle w:val="ListBullet"/>
+        <w:spacing w:after="60" w:before="20"/>
+      </w:pPr>
+      <w:r>
+        <w:rPr>
+          <w:color w:val="1A1A2E"/>
+          <w:sz w:val="21"/>
+        </w:rPr>
+        <w:t>Breadcrumb navigation; DEO is the terminal level — CEO/ADEO sub-office details are not listed.</w:t>
+      </w:r>
+    </w:p>
+    <w:p>
+      <w:pPr>
+        <w:pStyle w:val="ListBullet"/>
+        <w:spacing w:after="60" w:before="20"/>
+      </w:pPr>
+      <w:r>
+        <w:rPr>
+          <w:color w:val="1A1A2E"/>
+          <w:sz w:val="21"/>
+        </w:rPr>
+        <w:t>Aggregates are computed in OrgDrilldownView (/api/dashboard/org-drilldown/) using org.get_subtree_ids() scoped to the user's isolation level.</w:t>
+      </w:r>
+    </w:p>
+    <w:p>
+      <w:pPr>
+        <w:pStyle w:val="ListBullet"/>
+        <w:spacing w:after="60" w:before="20"/>
+      </w:pPr>
+      <w:r>
+        <w:rPr>
+          <w:color w:val="1A1A2E"/>
+          <w:sz w:val="21"/>
+        </w:rPr>
+        <w:t>No project names, document titles, or feature data are ever exposed — only aggregate counts.</w:t>
       </w:r>
     </w:p>
     <w:p>
@@ -3072,6 +3839,198 @@
                 <w:color w:val="1A1A2E"/>
                 <w:sz w:val="19"/>
               </w:rPr>
+              <w:t>Watermarking</w:t>
+            </w:r>
+          </w:p>
+        </w:tc>
+        <w:tc>
+          <w:tcPr>
+            <w:tcW w:type="dxa" w:w="3456"/>
+            <w:shd w:val="clear" w:color="auto" w:fill="FFFFFF"/>
+          </w:tcPr>
+          <w:p>
+            <w:r>
+              <w:rPr>
+                <w:color w:val="1A1A2E"/>
+                <w:sz w:val="19"/>
+              </w:rPr>
+              <w:t>C2PA SDK + custom LP-DNA steganography</w:t>
+            </w:r>
+          </w:p>
+        </w:tc>
+        <w:tc>
+          <w:tcPr>
+            <w:tcW w:type="dxa" w:w="3744"/>
+            <w:shd w:val="clear" w:color="auto" w:fill="FFFFFF"/>
+          </w:tcPr>
+          <w:p>
+            <w:r>
+              <w:rPr>
+                <w:color w:val="1A1A2E"/>
+                <w:sz w:val="19"/>
+              </w:rPr>
+              <w:t>Provenance watermarking on all terrain and document exports</w:t>
+            </w:r>
+          </w:p>
+        </w:tc>
+      </w:tr>
+      <w:tr>
+        <w:tc>
+          <w:tcPr>
+            <w:tcW w:type="dxa" w:w="2304"/>
+            <w:shd w:val="clear" w:color="auto" w:fill="F0F4F8"/>
+          </w:tcPr>
+          <w:p>
+            <w:r>
+              <w:rPr>
+                <w:b/>
+                <w:color w:val="1A1A2E"/>
+                <w:sz w:val="19"/>
+              </w:rPr>
+              <w:t>TOTP 2FA</w:t>
+            </w:r>
+          </w:p>
+        </w:tc>
+        <w:tc>
+          <w:tcPr>
+            <w:tcW w:type="dxa" w:w="3456"/>
+            <w:shd w:val="clear" w:color="auto" w:fill="F0F4F8"/>
+          </w:tcPr>
+          <w:p>
+            <w:r>
+              <w:rPr>
+                <w:color w:val="1A1A2E"/>
+                <w:sz w:val="19"/>
+              </w:rPr>
+              <w:t>pyotp</w:t>
+            </w:r>
+          </w:p>
+        </w:tc>
+        <w:tc>
+          <w:tcPr>
+            <w:tcW w:type="dxa" w:w="3744"/>
+            <w:shd w:val="clear" w:color="auto" w:fill="F0F4F8"/>
+          </w:tcPr>
+          <w:p>
+            <w:r>
+              <w:rPr>
+                <w:color w:val="1A1A2E"/>
+                <w:sz w:val="19"/>
+              </w:rPr>
+              <w:t>Mandatory TOTP two-factor authentication for all accounts</w:t>
+            </w:r>
+          </w:p>
+        </w:tc>
+      </w:tr>
+      <w:tr>
+        <w:tc>
+          <w:tcPr>
+            <w:tcW w:type="dxa" w:w="2304"/>
+            <w:shd w:val="clear" w:color="auto" w:fill="FFFFFF"/>
+          </w:tcPr>
+          <w:p>
+            <w:r>
+              <w:rPr>
+                <w:b/>
+                <w:color w:val="1A1A2E"/>
+                <w:sz w:val="19"/>
+              </w:rPr>
+              <w:t>Offline PWA</w:t>
+            </w:r>
+          </w:p>
+        </w:tc>
+        <w:tc>
+          <w:tcPr>
+            <w:tcW w:type="dxa" w:w="3456"/>
+            <w:shd w:val="clear" w:color="auto" w:fill="FFFFFF"/>
+          </w:tcPr>
+          <w:p>
+            <w:r>
+              <w:rPr>
+                <w:color w:val="1A1A2E"/>
+                <w:sz w:val="19"/>
+              </w:rPr>
+              <w:t>IndexedDB (browser-native)</w:t>
+            </w:r>
+          </w:p>
+        </w:tc>
+        <w:tc>
+          <w:tcPr>
+            <w:tcW w:type="dxa" w:w="3744"/>
+            <w:shd w:val="clear" w:color="auto" w:fill="FFFFFF"/>
+          </w:tcPr>
+          <w:p>
+            <w:r>
+              <w:rPr>
+                <w:color w:val="1A1A2E"/>
+                <w:sz w:val="19"/>
+              </w:rPr>
+              <w:t>Offline feature queue, project cache, GPS sync for Field Companion</w:t>
+            </w:r>
+          </w:p>
+        </w:tc>
+      </w:tr>
+      <w:tr>
+        <w:tc>
+          <w:tcPr>
+            <w:tcW w:type="dxa" w:w="2304"/>
+            <w:shd w:val="clear" w:color="auto" w:fill="F0F4F8"/>
+          </w:tcPr>
+          <w:p>
+            <w:r>
+              <w:rPr>
+                <w:b/>
+                <w:color w:val="1A1A2E"/>
+                <w:sz w:val="19"/>
+              </w:rPr>
+              <w:t>3D globe</w:t>
+            </w:r>
+          </w:p>
+        </w:tc>
+        <w:tc>
+          <w:tcPr>
+            <w:tcW w:type="dxa" w:w="3456"/>
+            <w:shd w:val="clear" w:color="auto" w:fill="F0F4F8"/>
+          </w:tcPr>
+          <w:p>
+            <w:r>
+              <w:rPr>
+                <w:color w:val="1A1A2E"/>
+                <w:sz w:val="19"/>
+              </w:rPr>
+              <w:t>Cesium.js 1.141</w:t>
+            </w:r>
+          </w:p>
+        </w:tc>
+        <w:tc>
+          <w:tcPr>
+            <w:tcW w:type="dxa" w:w="3744"/>
+            <w:shd w:val="clear" w:color="auto" w:fill="F0F4F8"/>
+          </w:tcPr>
+          <w:p>
+            <w:r>
+              <w:rPr>
+                <w:color w:val="1A1A2E"/>
+                <w:sz w:val="19"/>
+              </w:rPr>
+              <w:t>3D terrain viewer with 16 DEM analysis tools and vector overlay</w:t>
+            </w:r>
+          </w:p>
+        </w:tc>
+      </w:tr>
+      <w:tr>
+        <w:tc>
+          <w:tcPr>
+            <w:tcW w:type="dxa" w:w="2304"/>
+            <w:shd w:val="clear" w:color="auto" w:fill="FFFFFF"/>
+          </w:tcPr>
+          <w:p>
+            <w:r>
+              <w:rPr>
+                <w:b/>
+                <w:color w:val="1A1A2E"/>
+                <w:sz w:val="19"/>
+              </w:rPr>
               <w:t>Web server</w:t>
             </w:r>
           </w:p>
@@ -3795,6 +4754,195 @@
     </w:p>
     <w:p>
       <w:pPr>
+        <w:pStyle w:val="ListBullet"/>
+        <w:spacing w:after="80" w:before="20"/>
+      </w:pPr>
+      <w:r>
+        <w:rPr>
+          <w:b/>
+          <w:color w:val="4A6A00"/>
+          <w:sz w:val="21"/>
+        </w:rPr>
+        <w:t xml:space="preserve">Mandatory TOTP 2FA: </w:t>
+      </w:r>
+      <w:r>
+        <w:rPr>
+          <w:color w:val="1A1A2E"/>
+          <w:sz w:val="21"/>
+        </w:rPr>
+        <w:t>All user accounts are required to enrol in and pass TOTP two-factor authentication. First login triggers QR-code enrolment; every subsequent login requires a 6-digit OTP. No session token is ever issued without a valid OTP.</w:t>
+      </w:r>
+    </w:p>
+    <w:p>
+      <w:pPr>
+        <w:pStyle w:val="ListBullet"/>
+        <w:spacing w:after="80" w:before="20"/>
+      </w:pPr>
+      <w:r>
+        <w:rPr>
+          <w:b/>
+          <w:color w:val="4A6A00"/>
+          <w:sz w:val="21"/>
+        </w:rPr>
+        <w:t xml:space="preserve">C2PA + LP-DNA watermarking: </w:t>
+      </w:r>
+      <w:r>
+        <w:rPr>
+          <w:color w:val="1A1A2E"/>
+          <w:sz w:val="21"/>
+        </w:rPr>
+        <w:t>All terrain analysis exports (PNG, GeoJSON, CSV), uploaded documents, and AI-generated report PDFs carry C2PA cryptographic provenance assertions and Living Provenance DNA steganographic watermarks that bind the file to its project and creator.</w:t>
+      </w:r>
+    </w:p>
+    <w:p>
+      <w:pPr>
+        <w:pStyle w:val="ListBullet"/>
+        <w:spacing w:after="80" w:before="20"/>
+      </w:pPr>
+      <w:r>
+        <w:rPr>
+          <w:b/>
+          <w:color w:val="4A6A00"/>
+          <w:sz w:val="21"/>
+        </w:rPr>
+        <w:t xml:space="preserve">AI Survey Report Generator: </w:t>
+      </w:r>
+      <w:r>
+        <w:rPr>
+          <w:color w:val="1A1A2E"/>
+          <w:sz w:val="21"/>
+        </w:rPr>
+        <w:t>One-click AI-authored survey report: the local LLM writes a structured narrative from project statistics, feature counts, and document inventory. Output is a watermarked PDF plus an editable .docx opened directly in OnlyOffice.</w:t>
+      </w:r>
+    </w:p>
+    <w:p>
+      <w:pPr>
+        <w:pStyle w:val="ListBullet"/>
+        <w:spacing w:after="80" w:before="20"/>
+      </w:pPr>
+      <w:r>
+        <w:rPr>
+          <w:b/>
+          <w:color w:val="4A6A00"/>
+          <w:sz w:val="21"/>
+        </w:rPr>
+        <w:t xml:space="preserve">Attribute Auto-Validator: </w:t>
+      </w:r>
+      <w:r>
+        <w:rPr>
+          <w:color w:val="1A1A2E"/>
+          <w:sz w:val="21"/>
+        </w:rPr>
+        <w:t>Automatic post-import validation checks duplicate IDs, missing required attributes, zero-area polygons, and out-of-India features. Results are stored in ShapefileImport.validation_warnings and shown in the Import Status UI.</w:t>
+      </w:r>
+    </w:p>
+    <w:p>
+      <w:pPr>
+        <w:pStyle w:val="ListBullet"/>
+        <w:spacing w:after="80" w:before="20"/>
+      </w:pPr>
+      <w:r>
+        <w:rPr>
+          <w:b/>
+          <w:color w:val="4A6A00"/>
+          <w:sz w:val="21"/>
+        </w:rPr>
+        <w:t xml:space="preserve">Offline PWA Field Companion: </w:t>
+      </w:r>
+      <w:r>
+        <w:rPr>
+          <w:color w:val="1A1A2E"/>
+          <w:sz w:val="21"/>
+        </w:rPr>
+        <w:t>A Progressive Web App at /field-companion provides GPS-guided feature capture in the field with IndexedDB caching, offline feature queue, and automatic sync on reconnection. A pending-sync badge on the Map toolbar shows the outbox count.</w:t>
+      </w:r>
+    </w:p>
+    <w:p>
+      <w:pPr>
+        <w:pStyle w:val="ListBullet"/>
+        <w:spacing w:after="80" w:before="20"/>
+      </w:pPr>
+      <w:r>
+        <w:rPr>
+          <w:b/>
+          <w:color w:val="4A6A00"/>
+          <w:sz w:val="21"/>
+        </w:rPr>
+        <w:t xml:space="preserve">Per-Feature Comment Threads: </w:t>
+      </w:r>
+      <w:r>
+        <w:rPr>
+          <w:color w:val="1A1A2E"/>
+          <w:sz w:val="21"/>
+        </w:rPr>
+        <w:t>Any GIS feature carries a threaded discussion (FeatureComment model) shown in the Feature Info drawer with role-coloured tags and an inline reply box.</w:t>
+      </w:r>
+    </w:p>
+    <w:p>
+      <w:pPr>
+        <w:pStyle w:val="ListBullet"/>
+        <w:spacing w:after="80" w:before="20"/>
+      </w:pPr>
+      <w:r>
+        <w:rPr>
+          <w:b/>
+          <w:color w:val="4A6A00"/>
+          <w:sz w:val="21"/>
+        </w:rPr>
+        <w:t xml:space="preserve">Office Drilldown Dashboard: </w:t>
+      </w:r>
+      <w:r>
+        <w:rPr>
+          <w:color w:val="1A1A2E"/>
+          <w:sz w:val="21"/>
+        </w:rPr>
+        <w:t>DGDE and PDDE users have a hierarchical aggregates dashboard: national → command → DEO, navigable with breadcrumb. Aggregate counts only — no per-project content is exposed.</w:t>
+      </w:r>
+    </w:p>
+    <w:p>
+      <w:pPr>
+        <w:pStyle w:val="ListBullet"/>
+        <w:spacing w:after="80" w:before="20"/>
+      </w:pPr>
+      <w:r>
+        <w:rPr>
+          <w:b/>
+          <w:color w:val="4A6A00"/>
+          <w:sz w:val="21"/>
+        </w:rPr>
+        <w:t xml:space="preserve">Strict HQ data isolation: </w:t>
+      </w:r>
+      <w:r>
+        <w:rPr>
+          <w:color w:val="1A1A2E"/>
+          <w:sz w:val="21"/>
+        </w:rPr>
+        <w:t>DGDE, PDDE, and org-attached superadmins see only their own office content. Subordinate office projects, documents, features, and folders are never visible to HQ users; published maps reach them only through the Map Viewer. Enforced centrally by hq_level() and org_queryset_filter() across all API viewsets, dashboard, search, AI, reports, and workflow.</w:t>
+      </w:r>
+    </w:p>
+    <w:p>
+      <w:pPr>
+        <w:pStyle w:val="ListBullet"/>
+        <w:spacing w:after="80" w:before="20"/>
+      </w:pPr>
+      <w:r>
+        <w:rPr>
+          <w:b/>
+          <w:color w:val="4A6A00"/>
+          <w:sz w:val="21"/>
+        </w:rPr>
+        <w:t xml:space="preserve">3D vector file overlay and analysis: </w:t>
+      </w:r>
+      <w:r>
+        <w:rPr>
+          <w:color w:val="1A1A2E"/>
+          <w:sz w:val="21"/>
+        </w:rPr>
+        <w:t>Shapefile, GeoJSON, KML, KMZ, and GeoPackage files can be uploaded directly into the 3D Terrain viewer; Cesium renders them as a 3D overlay and can trigger slope analysis over the vector bounding box in one click.</w:t>
+      </w:r>
+    </w:p>
+    <w:p>
+      <w:pPr>
         <w:spacing w:before="160" w:after="120"/>
       </w:pPr>
       <w:r>
@@ -3804,27 +4952,6 @@
           <w:sz w:val="24"/>
         </w:rPr>
         <w:t>6.2  Planned for Future Iterations</w:t>
-      </w:r>
-    </w:p>
-    <w:p>
-      <w:pPr>
-        <w:pStyle w:val="ListBullet"/>
-        <w:spacing w:after="80" w:before="20"/>
-      </w:pPr>
-      <w:r>
-        <w:rPr>
-          <w:b/>
-          <w:color w:val="4A6A00"/>
-          <w:sz w:val="21"/>
-        </w:rPr>
-        <w:t xml:space="preserve">Mobile field surveying app: </w:t>
-      </w:r>
-      <w:r>
-        <w:rPr>
-          <w:color w:val="1A1A2E"/>
-          <w:sz w:val="21"/>
-        </w:rPr>
-        <w:t>A Progressive Web App (PWA) or React Native client for GPS-assisted feature capture in the field with offline sync on reconnection.</w:t>
       </w:r>
     </w:p>
     <w:p>
@@ -3846,6 +4973,27 @@
           <w:sz w:val="21"/>
         </w:rPr>
         <w:t>REST API connectors to DILRMP (Digital India Land Records Modernisation Programme) for cross-referencing defence parcels against state revenue records.</w:t>
+      </w:r>
+    </w:p>
+    <w:p>
+      <w:pPr>
+        <w:pStyle w:val="ListBullet"/>
+        <w:spacing w:after="80" w:before="20"/>
+      </w:pPr>
+      <w:r>
+        <w:rPr>
+          <w:b/>
+          <w:color w:val="4A6A00"/>
+          <w:sz w:val="21"/>
+        </w:rPr>
+        <w:t xml:space="preserve">React Native mobile client: </w:t>
+      </w:r>
+      <w:r>
+        <w:rPr>
+          <w:color w:val="1A1A2E"/>
+          <w:sz w:val="21"/>
+        </w:rPr>
+        <w:t>Native iOS/Android app with biometric auth, higher-fidelity GPS integration, and background sync — extending the existing PWA offline model to native performance.</w:t>
       </w:r>
     </w:p>
     <w:p>
@@ -3929,7 +5077,7 @@
           <w:color w:val="555555"/>
           <w:sz w:val="17"/>
         </w:rPr>
-        <w:t>RakshaGIS — Defence Estate GIS Survey Platform  |  Prepared: 05 June 2026  |  DGDE, Government of India  |  CONFIDENTIAL</w:t>
+        <w:t>RakshaGIS — Defence Estate GIS Survey Platform  |  Prepared: 12 June 2026  |  DGDE, Government of India  |  CONFIDENTIAL</w:t>
       </w:r>
     </w:p>
     <w:sectPr>

</xml_diff>